<commit_message>
Fix model and missing-reading crashes, match inflected keywords, correct docs
- A model that fails at prediction time no longer stops the whole run
- A missing joint reading now triggers EMERGENCY_STOP instead of a TypeError
- Note keywords match by prefix so squeaking/noises/sparking count
- Explanation and README wording corrected to match the data and code
</commit_message>
<xml_diff>
--- a/robotic_arm/explanation.docx
+++ b/robotic_arm/explanation.docx
@@ -1057,7 +1057,7 @@
     </w:p>
     <w:p>
       <w:r>
-        <w:t xml:space="preserve">Healthy joints run at 35–50 °C, and the most worn joints in the history reach about 77 °C. Above 85 °C, gearbox grease starts breaking down quickly, and the motor and encoder electronics get close to their limits. The value is also above the worst case from wear alone, so only a real fault crosses it.</w:t>
+        <w:t xml:space="preserve">A new joint runs at 35–50 °C, and the hottest joint anywhere in the history reaches about 77 °C. Above 85 °C, gearbox grease starts breaking down quickly, and the motor and encoder electronics get close to their limits. The value is also above the worst case from wear alone, so only a real fault crosses it.</w:t>
       </w:r>
     </w:p>
     <w:p>
@@ -1070,7 +1070,7 @@
     </w:p>
     <w:p>
       <w:r>
-        <w:t xml:space="preserve">Healthy joints vibrate at 1–3 mm/s, and worn joints in the history reach about 10 mm/s. General machine vibration charts (ISO 10816 style) treat values above roughly 11 mm/s as levels that cause damage. 12 mm/s is just above that and above the worst worn reading.</w:t>
+        <w:t xml:space="preserve">A new joint vibrates at 1–3 mm/s, and the worst joint in the history reaches about 10 mm/s. General machine vibration charts (ISO 10816 style) treat values above roughly 11 mm/s as levels that cause damage. 12 mm/s is just above that and above the worst worn reading.</w:t>
       </w:r>
     </w:p>
     <w:p>
@@ -1695,7 +1695,7 @@
                 <w:sz w:val="20"/>
                 <w:szCs w:val="20"/>
               </w:rPr>
-              <w:t xml:space="preserve">Any safety limit is crossed</w:t>
+              <w:t xml:space="preserve">Any safety limit is crossed, or a joint reading is missing</w:t>
             </w:r>
           </w:p>
         </w:tc>
@@ -2153,6 +2153,25 @@
       </w:r>
       <w:r>
         <w:t xml:space="preserve"> and the decision uses the notes, the spoof check and the safety stop.</w:t>
+      </w:r>
+    </w:p>
+    <w:p>
+      <w:pPr>
+        <w:pStyle w:val="ListParagraph"/>
+        <w:numPr>
+          <w:ilvl w:val="0"/>
+          <w:numId w:val="2"/>
+        </w:numPr>
+      </w:pPr>
+      <w:r>
+        <w:rPr>
+          <w:b/>
+          <w:bCs/>
+        </w:rPr>
+        <w:t xml:space="preserve">A missing sensor reading counts as danger.</w:t>
+      </w:r>
+      <w:r>
+        <w:t xml:space="preserve"> If a joint can't report torque, current, temperature or vibration, the system can't prove it is safe, so the arm is stopped.</w:t>
       </w:r>
     </w:p>
     <w:p>
@@ -2910,7 +2929,7 @@
         </w:numPr>
       </w:pPr>
       <w:r>
-        <w:t xml:space="preserve">Keyword matching does not understand sentences. "Grinding was fixed yesterday" still scores 3.</w:t>
+        <w:t xml:space="preserve">Keyword matching does not understand sentences. "Grinding was fixed yesterday" still scores 3. Words are matched by how they start, so "squeaking" counts, but "noisy" does not.</w:t>
       </w:r>
     </w:p>
     <w:p>
@@ -2922,7 +2941,7 @@
         </w:numPr>
       </w:pPr>
       <w:r>
-        <w:t xml:space="preserve">Negation only looks at the one word before the keyword.</w:t>
+        <w:t xml:space="preserve">Negation only looks at the one word before the keyword, and a line naming two arms only counts for the first one.</w:t>
       </w:r>
     </w:p>
     <w:p>
@@ -3615,7 +3634,7 @@
         <w:t xml:space="preserve">Small spoofs inside the 25% tolerance.</w:t>
       </w:r>
       <w:r>
-        <w:t xml:space="preserve"> For ARM-05, a fake value of 144 Nm or more would pass the check. The real 192 Nm would then be hidden behind a value under the 180 Nm limit. The tolerance creates a band the attacker can hide in.</w:t>
+        <w:t xml:space="preserve"> For ARM-05, any fake value from 144 to 180 Nm passes the spoof check and stays under the 180 Nm limit, so the real 192 Nm would be hidden. The tolerance creates a band the attacker can hide in.</w:t>
       </w:r>
     </w:p>
     <w:p>

</xml_diff>